<commit_message>
Modificacion del documento principal
Mejoras del avance 2
</commit_message>
<xml_diff>
--- a/01 Documentación/01.01 Proyecto/Avance Proyecto Final.docx
+++ b/01 Documentación/01.01 Proyecto/Avance Proyecto Final.docx
@@ -272,6 +272,15 @@
           <w:szCs w:val="24"/>
         </w:rPr>
         <w:t>Maquera Atencio David</w:t>
+      </w:r>
+      <w:r>
+        <w:rPr>
+          <w:rFonts w:ascii="Times New Roman" w:hAnsi="Times New Roman" w:cs="Times New Roman"/>
+          <w:bCs/>
+          <w:sz w:val="24"/>
+          <w:szCs w:val="24"/>
+        </w:rPr>
+        <w:t xml:space="preserve"> Chris</w:t>
       </w:r>
     </w:p>
     <w:p>
@@ -4250,21 +4259,7 @@
                 <w:rStyle w:val="Hipervnculo"/>
                 <w:noProof/>
               </w:rPr>
-              <w:t>Gestión de calidad de</w:t>
-            </w:r>
-            <w:r>
-              <w:rPr>
-                <w:rStyle w:val="Hipervnculo"/>
-                <w:noProof/>
-              </w:rPr>
-              <w:t xml:space="preserve"> </w:t>
-            </w:r>
-            <w:r>
-              <w:rPr>
-                <w:rStyle w:val="Hipervnculo"/>
-                <w:noProof/>
-              </w:rPr>
-              <w:t>procesos y productos</w:t>
+              <w:t>Gestión de calidad de procesos y productos</w:t>
             </w:r>
             <w:r>
               <w:rPr>
@@ -12809,10 +12804,9 @@
           <w:noProof/>
           <w:lang w:val="es-ES"/>
         </w:rPr>
-        <w:lastRenderedPageBreak/>
         <w:drawing>
-          <wp:inline distT="0" distB="0" distL="0" distR="0" wp14:anchorId="18296859" wp14:editId="76F09973">
-            <wp:extent cx="3848637" cy="2534004"/>
+          <wp:inline distT="0" distB="0" distL="0" distR="0" wp14:anchorId="18296859" wp14:editId="064CD724">
+            <wp:extent cx="3127791" cy="2059388"/>
             <wp:effectExtent l="0" t="0" r="0" b="0"/>
             <wp:docPr id="337571276" name="Imagen 1" descr="Interfaz de usuario gráfica, Texto, Aplicación, Correo electrónico&#10;&#10;El contenido generado por IA puede ser incorrecto."/>
             <wp:cNvGraphicFramePr>
@@ -12834,7 +12828,7 @@
                   <pic:spPr>
                     <a:xfrm>
                       <a:off x="0" y="0"/>
-                      <a:ext cx="3848637" cy="2534004"/>
+                      <a:ext cx="3134633" cy="2063893"/>
                     </a:xfrm>
                     <a:prstGeom prst="rect">
                       <a:avLst/>
@@ -12847,9 +12841,911 @@
         </w:drawing>
       </w:r>
     </w:p>
+    <w:p>
+      <w:pPr>
+        <w:pStyle w:val="Ttulo1"/>
+        <w:rPr>
+          <w:lang w:val="es-ES"/>
+        </w:rPr>
+      </w:pPr>
+      <w:r>
+        <w:rPr>
+          <w:lang w:val="es-ES"/>
+        </w:rPr>
+        <w:lastRenderedPageBreak/>
+        <w:t xml:space="preserve">CAPITULO </w:t>
+      </w:r>
+      <w:r>
+        <w:rPr>
+          <w:lang w:val="es-ES"/>
+        </w:rPr>
+        <w:t>4</w:t>
+      </w:r>
+      <w:r>
+        <w:rPr>
+          <w:lang w:val="es-ES"/>
+        </w:rPr>
+        <w:t>: SCRUM</w:t>
+      </w:r>
+    </w:p>
+    <w:p>
+      <w:pPr>
+        <w:pStyle w:val="Ttulo2"/>
+        <w:rPr>
+          <w:lang w:val="es-ES"/>
+        </w:rPr>
+      </w:pPr>
+      <w:r>
+        <w:rPr>
+          <w:lang w:val="es-ES"/>
+        </w:rPr>
+        <w:t>Inicio</w:t>
+      </w:r>
+    </w:p>
+    <w:p>
+      <w:pPr>
+        <w:pStyle w:val="Ttulo3"/>
+        <w:rPr>
+          <w:lang w:val="es-ES"/>
+        </w:rPr>
+      </w:pPr>
+      <w:r>
+        <w:rPr>
+          <w:lang w:val="es-ES"/>
+        </w:rPr>
+        <w:t>Desarrollo de la visión del proyecto</w:t>
+      </w:r>
+    </w:p>
+    <w:p>
+      <w:pPr>
+        <w:pStyle w:val="Texto"/>
+        <w:rPr>
+          <w:lang w:val="es-ES"/>
+        </w:rPr>
+      </w:pPr>
+      <w:r>
+        <w:rPr>
+          <w:lang w:val="es-ES"/>
+        </w:rPr>
+        <w:t>Ser una plataforma de subasta que brinda comodidad y seguridad en las pujas, brindando satisfacción a los clientes y empresas.</w:t>
+      </w:r>
+    </w:p>
+    <w:p>
+      <w:pPr>
+        <w:pStyle w:val="Ttulo3"/>
+        <w:rPr>
+          <w:lang w:val="es-ES"/>
+        </w:rPr>
+      </w:pPr>
+      <w:r>
+        <w:rPr>
+          <w:lang w:val="es-ES"/>
+        </w:rPr>
+        <w:t>Definición de los roles de Scrum</w:t>
+      </w:r>
+    </w:p>
+    <w:tbl>
+      <w:tblPr>
+        <w:tblStyle w:val="Tablaconcuadrcula"/>
+        <w:tblW w:w="8080" w:type="dxa"/>
+        <w:tblInd w:w="1413" w:type="dxa"/>
+        <w:tblLook w:val="04A0" w:firstRow="1" w:lastRow="0" w:firstColumn="1" w:lastColumn="0" w:noHBand="0" w:noVBand="1"/>
+      </w:tblPr>
+      <w:tblGrid>
+        <w:gridCol w:w="1701"/>
+        <w:gridCol w:w="6379"/>
+      </w:tblGrid>
+      <w:tr>
+        <w:tc>
+          <w:tcPr>
+            <w:tcW w:w="1701" w:type="dxa"/>
+            <w:shd w:val="clear" w:color="auto" w:fill="E7E6E6" w:themeFill="background2"/>
+            <w:vAlign w:val="center"/>
+          </w:tcPr>
+          <w:p>
+            <w:pPr>
+              <w:spacing w:line="360" w:lineRule="auto"/>
+              <w:jc w:val="center"/>
+              <w:rPr>
+                <w:rFonts w:ascii="Times New Roman" w:hAnsi="Times New Roman" w:cs="Times New Roman"/>
+                <w:sz w:val="24"/>
+                <w:szCs w:val="24"/>
+                <w:lang w:val="es-ES"/>
+              </w:rPr>
+            </w:pPr>
+            <w:proofErr w:type="spellStart"/>
+            <w:r>
+              <w:rPr>
+                <w:rFonts w:ascii="Times New Roman" w:hAnsi="Times New Roman" w:cs="Times New Roman"/>
+                <w:sz w:val="24"/>
+                <w:szCs w:val="24"/>
+                <w:lang w:val="es-ES"/>
+              </w:rPr>
+              <w:t>Product</w:t>
+            </w:r>
+            <w:proofErr w:type="spellEnd"/>
+            <w:r>
+              <w:rPr>
+                <w:rFonts w:ascii="Times New Roman" w:hAnsi="Times New Roman" w:cs="Times New Roman"/>
+                <w:sz w:val="24"/>
+                <w:szCs w:val="24"/>
+                <w:lang w:val="es-ES"/>
+              </w:rPr>
+              <w:t xml:space="preserve"> </w:t>
+            </w:r>
+            <w:proofErr w:type="spellStart"/>
+            <w:r>
+              <w:rPr>
+                <w:rFonts w:ascii="Times New Roman" w:hAnsi="Times New Roman" w:cs="Times New Roman"/>
+                <w:sz w:val="24"/>
+                <w:szCs w:val="24"/>
+                <w:lang w:val="es-ES"/>
+              </w:rPr>
+              <w:t>Owner</w:t>
+            </w:r>
+            <w:proofErr w:type="spellEnd"/>
+          </w:p>
+        </w:tc>
+        <w:tc>
+          <w:tcPr>
+            <w:tcW w:w="6379" w:type="dxa"/>
+          </w:tcPr>
+          <w:p>
+            <w:pPr>
+              <w:spacing w:line="360" w:lineRule="auto"/>
+              <w:rPr>
+                <w:rFonts w:ascii="Times New Roman" w:hAnsi="Times New Roman" w:cs="Times New Roman"/>
+                <w:sz w:val="24"/>
+                <w:szCs w:val="24"/>
+                <w:lang w:val="es-ES"/>
+              </w:rPr>
+            </w:pPr>
+            <w:r>
+              <w:rPr>
+                <w:rFonts w:ascii="Times New Roman" w:hAnsi="Times New Roman" w:cs="Times New Roman"/>
+                <w:sz w:val="24"/>
+                <w:szCs w:val="24"/>
+                <w:lang w:val="es-ES"/>
+              </w:rPr>
+              <w:t>Melissa Cervantes</w:t>
+            </w:r>
+          </w:p>
+        </w:tc>
+      </w:tr>
+      <w:tr>
+        <w:tc>
+          <w:tcPr>
+            <w:tcW w:w="1701" w:type="dxa"/>
+            <w:shd w:val="clear" w:color="auto" w:fill="E7E6E6" w:themeFill="background2"/>
+            <w:vAlign w:val="center"/>
+          </w:tcPr>
+          <w:p>
+            <w:pPr>
+              <w:spacing w:line="360" w:lineRule="auto"/>
+              <w:jc w:val="center"/>
+              <w:rPr>
+                <w:rFonts w:ascii="Times New Roman" w:hAnsi="Times New Roman" w:cs="Times New Roman"/>
+                <w:sz w:val="24"/>
+                <w:szCs w:val="24"/>
+                <w:lang w:val="es-ES"/>
+              </w:rPr>
+            </w:pPr>
+            <w:r>
+              <w:rPr>
+                <w:rFonts w:ascii="Times New Roman" w:hAnsi="Times New Roman" w:cs="Times New Roman"/>
+                <w:sz w:val="24"/>
+                <w:szCs w:val="24"/>
+                <w:lang w:val="es-ES"/>
+              </w:rPr>
+              <w:t xml:space="preserve">Scrum </w:t>
+            </w:r>
+            <w:proofErr w:type="gramStart"/>
+            <w:r>
+              <w:rPr>
+                <w:rFonts w:ascii="Times New Roman" w:hAnsi="Times New Roman" w:cs="Times New Roman"/>
+                <w:sz w:val="24"/>
+                <w:szCs w:val="24"/>
+                <w:lang w:val="es-ES"/>
+              </w:rPr>
+              <w:t>Master</w:t>
+            </w:r>
+            <w:proofErr w:type="gramEnd"/>
+          </w:p>
+        </w:tc>
+        <w:tc>
+          <w:tcPr>
+            <w:tcW w:w="6379" w:type="dxa"/>
+          </w:tcPr>
+          <w:p>
+            <w:pPr>
+              <w:spacing w:line="360" w:lineRule="auto"/>
+              <w:rPr>
+                <w:rFonts w:ascii="Times New Roman" w:hAnsi="Times New Roman" w:cs="Times New Roman"/>
+                <w:sz w:val="24"/>
+                <w:szCs w:val="24"/>
+                <w:lang w:val="es-ES"/>
+              </w:rPr>
+            </w:pPr>
+            <w:r>
+              <w:rPr>
+                <w:rFonts w:ascii="Times New Roman" w:hAnsi="Times New Roman" w:cs="Times New Roman"/>
+                <w:sz w:val="24"/>
+                <w:szCs w:val="24"/>
+                <w:lang w:val="es-ES"/>
+              </w:rPr>
+              <w:t>David Maquera</w:t>
+            </w:r>
+          </w:p>
+        </w:tc>
+      </w:tr>
+      <w:tr>
+        <w:tc>
+          <w:tcPr>
+            <w:tcW w:w="1701" w:type="dxa"/>
+            <w:shd w:val="clear" w:color="auto" w:fill="E7E6E6" w:themeFill="background2"/>
+            <w:vAlign w:val="center"/>
+          </w:tcPr>
+          <w:p>
+            <w:pPr>
+              <w:spacing w:line="360" w:lineRule="auto"/>
+              <w:jc w:val="center"/>
+              <w:rPr>
+                <w:rFonts w:ascii="Times New Roman" w:hAnsi="Times New Roman" w:cs="Times New Roman"/>
+                <w:sz w:val="24"/>
+                <w:szCs w:val="24"/>
+                <w:lang w:val="es-ES"/>
+              </w:rPr>
+            </w:pPr>
+            <w:r>
+              <w:rPr>
+                <w:rFonts w:ascii="Times New Roman" w:hAnsi="Times New Roman" w:cs="Times New Roman"/>
+                <w:sz w:val="24"/>
+                <w:szCs w:val="24"/>
+                <w:lang w:val="es-ES"/>
+              </w:rPr>
+              <w:t>Equipo Scrum</w:t>
+            </w:r>
+          </w:p>
+        </w:tc>
+        <w:tc>
+          <w:tcPr>
+            <w:tcW w:w="6379" w:type="dxa"/>
+          </w:tcPr>
+          <w:p>
+            <w:pPr>
+              <w:spacing w:line="360" w:lineRule="auto"/>
+              <w:rPr>
+                <w:rFonts w:ascii="Times New Roman" w:hAnsi="Times New Roman" w:cs="Times New Roman"/>
+                <w:sz w:val="24"/>
+                <w:szCs w:val="24"/>
+                <w:lang w:val="en-US"/>
+              </w:rPr>
+            </w:pPr>
+            <w:r>
+              <w:rPr>
+                <w:rFonts w:ascii="Times New Roman" w:hAnsi="Times New Roman" w:cs="Times New Roman"/>
+                <w:sz w:val="24"/>
+                <w:szCs w:val="24"/>
+              </w:rPr>
+              <w:t>Cervantes Melissa, Pacheco Miguel,</w:t>
+            </w:r>
+            <w:r>
+              <w:rPr>
+                <w:rFonts w:ascii="Times New Roman" w:hAnsi="Times New Roman" w:cs="Times New Roman"/>
+                <w:sz w:val="24"/>
+                <w:szCs w:val="24"/>
+                <w:lang w:val="es-MX"/>
+              </w:rPr>
+              <w:t xml:space="preserve"> Maquera </w:t>
+            </w:r>
+            <w:proofErr w:type="gramStart"/>
+            <w:r>
+              <w:rPr>
+                <w:rFonts w:ascii="Times New Roman" w:hAnsi="Times New Roman" w:cs="Times New Roman"/>
+                <w:sz w:val="24"/>
+                <w:szCs w:val="24"/>
+                <w:lang w:val="es-MX"/>
+              </w:rPr>
+              <w:t>David,</w:t>
+            </w:r>
+            <w:r>
+              <w:rPr>
+                <w:rFonts w:ascii="Times New Roman" w:hAnsi="Times New Roman" w:cs="Times New Roman"/>
+                <w:sz w:val="24"/>
+                <w:szCs w:val="24"/>
+                <w:lang w:val="en-US"/>
+              </w:rPr>
+              <w:t>Vargas</w:t>
+            </w:r>
+            <w:proofErr w:type="gramEnd"/>
+            <w:r>
+              <w:rPr>
+                <w:rFonts w:ascii="Times New Roman" w:hAnsi="Times New Roman" w:cs="Times New Roman"/>
+                <w:sz w:val="24"/>
+                <w:szCs w:val="24"/>
+                <w:lang w:val="en-US"/>
+              </w:rPr>
+              <w:t xml:space="preserve"> Stephany</w:t>
+            </w:r>
+          </w:p>
+        </w:tc>
+      </w:tr>
+    </w:tbl>
+    <w:p>
+      <w:pPr>
+        <w:pStyle w:val="Ttulo3"/>
+        <w:rPr>
+          <w:lang w:val="es-ES"/>
+        </w:rPr>
+      </w:pPr>
+      <w:r>
+        <w:rPr>
+          <w:lang w:val="es-ES"/>
+        </w:rPr>
+        <w:t>Desarrollo de las épicas</w:t>
+      </w:r>
+    </w:p>
+    <w:p>
+      <w:pPr>
+        <w:pStyle w:val="Ttulo3"/>
+        <w:rPr>
+          <w:lang w:val="es-ES"/>
+        </w:rPr>
+      </w:pPr>
+      <w:r>
+        <w:rPr>
+          <w:lang w:val="es-ES"/>
+        </w:rPr>
+        <w:t>Creación del backlog priorizado</w:t>
+      </w:r>
+    </w:p>
+    <w:p>
+      <w:pPr>
+        <w:pStyle w:val="Texto"/>
+        <w:ind w:left="720"/>
+        <w:rPr>
+          <w:lang w:val="es-ES"/>
+        </w:rPr>
+      </w:pPr>
+      <w:r>
+        <w:rPr>
+          <w:lang w:val="es-ES"/>
+        </w:rPr>
+        <w:t xml:space="preserve">Ver el archivo </w:t>
+      </w:r>
+      <w:proofErr w:type="spellStart"/>
+      <w:r>
+        <w:rPr>
+          <w:lang w:val="es-ES"/>
+        </w:rPr>
+        <w:t>Produc</w:t>
+      </w:r>
+      <w:proofErr w:type="spellEnd"/>
+      <w:r>
+        <w:rPr>
+          <w:lang w:val="es-ES"/>
+        </w:rPr>
+        <w:t xml:space="preserve"> </w:t>
+      </w:r>
+      <w:proofErr w:type="spellStart"/>
+      <w:r>
+        <w:rPr>
+          <w:lang w:val="es-ES"/>
+        </w:rPr>
+        <w:t>Blacklog</w:t>
+      </w:r>
+      <w:proofErr w:type="spellEnd"/>
+      <w:r>
+        <w:rPr>
+          <w:lang w:val="es-ES"/>
+        </w:rPr>
+        <w:t xml:space="preserve"> Genesis</w:t>
+      </w:r>
+    </w:p>
+    <w:p>
+      <w:pPr>
+        <w:pStyle w:val="Ttulo3"/>
+        <w:rPr>
+          <w:lang w:val="es-ES"/>
+        </w:rPr>
+      </w:pPr>
+      <w:r>
+        <w:rPr>
+          <w:lang w:val="es-ES"/>
+        </w:rPr>
+        <w:t>D</w:t>
+      </w:r>
+      <w:r>
+        <w:rPr>
+          <w:lang w:val="es-ES"/>
+        </w:rPr>
+        <w:t>esarrollo de la planificación del lanzamiento del proyecto</w:t>
+      </w:r>
+    </w:p>
+    <w:p>
+      <w:pPr>
+        <w:pStyle w:val="Ttulo2"/>
+        <w:rPr>
+          <w:lang w:val="es-ES"/>
+        </w:rPr>
+      </w:pPr>
+      <w:r>
+        <w:rPr>
+          <w:lang w:val="es-ES"/>
+        </w:rPr>
+        <w:t>Planificación y estimación</w:t>
+      </w:r>
+    </w:p>
+    <w:p>
+      <w:pPr>
+        <w:pStyle w:val="Ttulo3"/>
+        <w:rPr>
+          <w:lang w:val="es-ES"/>
+        </w:rPr>
+      </w:pPr>
+      <w:r>
+        <w:rPr>
+          <w:lang w:val="es-ES"/>
+        </w:rPr>
+        <w:t>Creación de historias de usuario</w:t>
+      </w:r>
+    </w:p>
+    <w:p>
+      <w:pPr>
+        <w:pStyle w:val="Ttulo3"/>
+        <w:rPr>
+          <w:lang w:val="es-ES"/>
+        </w:rPr>
+      </w:pPr>
+      <w:r>
+        <w:rPr>
+          <w:lang w:val="es-ES"/>
+        </w:rPr>
+        <w:t>Realización de estimación</w:t>
+      </w:r>
+    </w:p>
+    <w:p>
+      <w:pPr>
+        <w:pStyle w:val="Ttulo3"/>
+        <w:rPr>
+          <w:lang w:val="es-ES"/>
+        </w:rPr>
+      </w:pPr>
+      <w:r>
+        <w:rPr>
+          <w:lang w:val="es-ES"/>
+        </w:rPr>
+        <w:t>Asignación de historia de usuarios</w:t>
+      </w:r>
+    </w:p>
+    <w:p>
+      <w:pPr>
+        <w:pStyle w:val="Ttulo3"/>
+        <w:rPr>
+          <w:lang w:val="es-ES"/>
+        </w:rPr>
+      </w:pPr>
+      <w:r>
+        <w:rPr>
+          <w:lang w:val="es-ES"/>
+        </w:rPr>
+        <w:t>Creación de sprint backlog</w:t>
+      </w:r>
+    </w:p>
+    <w:p>
+      <w:pPr>
+        <w:pStyle w:val="Ttulo2"/>
+        <w:rPr>
+          <w:lang w:val="es-ES"/>
+        </w:rPr>
+      </w:pPr>
+      <w:r>
+        <w:rPr>
+          <w:lang w:val="es-ES"/>
+        </w:rPr>
+        <w:t>4.3 Implementación</w:t>
+      </w:r>
+    </w:p>
+    <w:p>
+      <w:pPr>
+        <w:pStyle w:val="Ttulo3"/>
+        <w:rPr>
+          <w:lang w:val="es-ES"/>
+        </w:rPr>
+      </w:pPr>
+      <w:r>
+        <w:rPr>
+          <w:lang w:val="es-ES"/>
+        </w:rPr>
+        <w:t>Creación de entregables</w:t>
+      </w:r>
+    </w:p>
+    <w:p>
+      <w:pPr>
+        <w:ind w:left="1440"/>
+        <w:rPr>
+          <w:lang w:val="es-ES"/>
+        </w:rPr>
+      </w:pPr>
+      <w:proofErr w:type="spellStart"/>
+      <w:r>
+        <w:rPr>
+          <w:lang w:val="es-ES"/>
+        </w:rPr>
+        <w:t>Blacklog</w:t>
+      </w:r>
+      <w:proofErr w:type="spellEnd"/>
+      <w:r>
+        <w:rPr>
+          <w:lang w:val="es-ES"/>
+        </w:rPr>
+        <w:t xml:space="preserve"> Inicial del Sprint 1</w:t>
+      </w:r>
+    </w:p>
+    <w:p>
+      <w:pPr>
+        <w:pStyle w:val="Ttulo3"/>
+        <w:rPr>
+          <w:lang w:val="es-ES"/>
+        </w:rPr>
+      </w:pPr>
+      <w:r>
+        <w:rPr>
+          <w:lang w:val="es-ES"/>
+        </w:rPr>
+        <w:lastRenderedPageBreak/>
+        <w:t>Mantenimiento de la lista priorizada de pendientes</w:t>
+      </w:r>
+    </w:p>
+    <w:p>
+      <w:pPr>
+        <w:pStyle w:val="Ttulo2"/>
+        <w:rPr>
+          <w:lang w:val="es-ES"/>
+        </w:rPr>
+      </w:pPr>
+      <w:r>
+        <w:rPr>
+          <w:lang w:val="es-ES"/>
+        </w:rPr>
+        <w:t>4.4 Revisión y retrospectiva</w:t>
+      </w:r>
+    </w:p>
+    <w:p>
+      <w:pPr>
+        <w:pStyle w:val="Ttulo3"/>
+        <w:rPr>
+          <w:lang w:val="es-ES"/>
+        </w:rPr>
+      </w:pPr>
+      <w:r>
+        <w:rPr>
+          <w:lang w:val="es-ES"/>
+        </w:rPr>
+        <w:t>Creación de evidencias de revisión y validación de sprint</w:t>
+      </w:r>
+    </w:p>
+    <w:p>
+      <w:pPr>
+        <w:pStyle w:val="Ttulo3"/>
+        <w:rPr>
+          <w:lang w:val="es-ES"/>
+        </w:rPr>
+      </w:pPr>
+      <w:r>
+        <w:rPr>
+          <w:lang w:val="es-ES"/>
+        </w:rPr>
+        <w:t>Elaboración de evidencias de retrospectiva de sprint</w:t>
+      </w:r>
+    </w:p>
+    <w:p>
+      <w:pPr>
+        <w:pStyle w:val="Ttulo2"/>
+        <w:rPr>
+          <w:lang w:val="es-ES"/>
+        </w:rPr>
+      </w:pPr>
+      <w:r>
+        <w:rPr>
+          <w:lang w:val="es-ES"/>
+        </w:rPr>
+        <w:t>4.5 Lanzamiento del proyecto</w:t>
+      </w:r>
+    </w:p>
+    <w:p>
+      <w:pPr>
+        <w:pStyle w:val="Ttulo3"/>
+        <w:rPr>
+          <w:lang w:val="es-ES"/>
+        </w:rPr>
+      </w:pPr>
+      <w:r>
+        <w:rPr>
+          <w:lang w:val="es-ES"/>
+        </w:rPr>
+        <w:t>Creación de la arquitectura del proyecto</w:t>
+      </w:r>
+    </w:p>
+    <w:p>
+      <w:pPr>
+        <w:pStyle w:val="Ttulo3"/>
+        <w:rPr>
+          <w:lang w:val="es-ES"/>
+        </w:rPr>
+      </w:pPr>
+      <w:r>
+        <w:rPr>
+          <w:lang w:val="es-ES"/>
+        </w:rPr>
+        <w:t>Elaboración de documentación</w:t>
+      </w:r>
+    </w:p>
+    <w:p>
+      <w:pPr>
+        <w:rPr>
+          <w:lang w:val="es-ES"/>
+        </w:rPr>
+      </w:pPr>
+    </w:p>
+    <w:p>
+      <w:pPr>
+        <w:rPr>
+          <w:lang w:val="es-ES"/>
+        </w:rPr>
+      </w:pPr>
+    </w:p>
+    <w:p>
+      <w:pPr>
+        <w:rPr>
+          <w:lang w:val="es-ES"/>
+        </w:rPr>
+      </w:pPr>
+    </w:p>
+    <w:p>
+      <w:pPr>
+        <w:rPr>
+          <w:lang w:val="es-ES"/>
+        </w:rPr>
+      </w:pPr>
+    </w:p>
+    <w:p>
+      <w:pPr>
+        <w:rPr>
+          <w:lang w:val="es-ES"/>
+        </w:rPr>
+      </w:pPr>
+    </w:p>
+    <w:p>
+      <w:pPr>
+        <w:rPr>
+          <w:lang w:val="es-ES"/>
+        </w:rPr>
+      </w:pPr>
+    </w:p>
+    <w:p>
+      <w:pPr>
+        <w:rPr>
+          <w:lang w:val="es-ES"/>
+        </w:rPr>
+      </w:pPr>
+    </w:p>
+    <w:p>
+      <w:pPr>
+        <w:rPr>
+          <w:lang w:val="es-ES"/>
+        </w:rPr>
+      </w:pPr>
+    </w:p>
+    <w:p>
+      <w:pPr>
+        <w:rPr>
+          <w:lang w:val="es-ES"/>
+        </w:rPr>
+      </w:pPr>
+    </w:p>
+    <w:p>
+      <w:pPr>
+        <w:rPr>
+          <w:lang w:val="es-ES"/>
+        </w:rPr>
+      </w:pPr>
+    </w:p>
+    <w:p>
+      <w:pPr>
+        <w:rPr>
+          <w:lang w:val="es-ES"/>
+        </w:rPr>
+      </w:pPr>
+    </w:p>
+    <w:p>
+      <w:pPr>
+        <w:rPr>
+          <w:lang w:val="es-ES"/>
+        </w:rPr>
+      </w:pPr>
+    </w:p>
+    <w:p>
+      <w:pPr>
+        <w:rPr>
+          <w:lang w:val="es-ES"/>
+        </w:rPr>
+      </w:pPr>
+    </w:p>
+    <w:p>
+      <w:pPr>
+        <w:rPr>
+          <w:lang w:val="es-ES"/>
+        </w:rPr>
+      </w:pPr>
+    </w:p>
+    <w:p>
+      <w:pPr>
+        <w:rPr>
+          <w:lang w:val="es-ES"/>
+        </w:rPr>
+      </w:pPr>
+      <w:r>
+        <w:rPr>
+          <w:lang w:val="es-ES"/>
+        </w:rPr>
+        <w:lastRenderedPageBreak/>
+        <w:drawing>
+          <wp:anchor distT="0" distB="0" distL="114300" distR="114300" simplePos="0" relativeHeight="251658240" behindDoc="0" locked="0" layoutInCell="1" allowOverlap="1" wp14:anchorId="38180A32" wp14:editId="129817F4">
+            <wp:simplePos x="0" y="0"/>
+            <wp:positionH relativeFrom="column">
+              <wp:posOffset>72428</wp:posOffset>
+            </wp:positionH>
+            <wp:positionV relativeFrom="paragraph">
+              <wp:posOffset>3734554</wp:posOffset>
+            </wp:positionV>
+            <wp:extent cx="5858789" cy="2101215"/>
+            <wp:effectExtent l="0" t="0" r="8890" b="0"/>
+            <wp:wrapNone/>
+            <wp:docPr id="1496097594" name="Imagen 1" descr="Interfaz de usuario gráfica, Texto, Aplicación, Correo electrónico&#10;&#10;El contenido generado por IA puede ser incorrecto."/>
+            <wp:cNvGraphicFramePr>
+              <a:graphicFrameLocks xmlns:a="http://schemas.openxmlformats.org/drawingml/2006/main" noChangeAspect="1"/>
+            </wp:cNvGraphicFramePr>
+            <a:graphic xmlns:a="http://schemas.openxmlformats.org/drawingml/2006/main">
+              <a:graphicData uri="http://schemas.openxmlformats.org/drawingml/2006/picture">
+                <pic:pic xmlns:pic="http://schemas.openxmlformats.org/drawingml/2006/picture">
+                  <pic:nvPicPr>
+                    <pic:cNvPr id="1496097594" name="Imagen 1" descr="Interfaz de usuario gráfica, Texto, Aplicación, Correo electrónico&#10;&#10;El contenido generado por IA puede ser incorrecto."/>
+                    <pic:cNvPicPr/>
+                  </pic:nvPicPr>
+                  <pic:blipFill>
+                    <a:blip r:embed="rId31">
+                      <a:extLst>
+                        <a:ext uri="{28A0092B-C50C-407E-A947-70E740481C1C}">
+                          <a14:useLocalDpi xmlns:a14="http://schemas.microsoft.com/office/drawing/2010/main" val="0"/>
+                        </a:ext>
+                      </a:extLst>
+                    </a:blip>
+                    <a:stretch>
+                      <a:fillRect/>
+                    </a:stretch>
+                  </pic:blipFill>
+                  <pic:spPr>
+                    <a:xfrm>
+                      <a:off x="0" y="0"/>
+                      <a:ext cx="5865796" cy="2103728"/>
+                    </a:xfrm>
+                    <a:prstGeom prst="rect">
+                      <a:avLst/>
+                    </a:prstGeom>
+                  </pic:spPr>
+                </pic:pic>
+              </a:graphicData>
+            </a:graphic>
+            <wp14:sizeRelH relativeFrom="page">
+              <wp14:pctWidth>0</wp14:pctWidth>
+            </wp14:sizeRelH>
+            <wp14:sizeRelV relativeFrom="page">
+              <wp14:pctHeight>0</wp14:pctHeight>
+            </wp14:sizeRelV>
+          </wp:anchor>
+        </w:drawing>
+      </w:r>
+      <w:r>
+        <w:rPr>
+          <w:lang w:val="es-ES"/>
+        </w:rPr>
+        <w:drawing>
+          <wp:inline distT="0" distB="0" distL="0" distR="0" wp14:anchorId="00F93D9A" wp14:editId="676BA0E3">
+            <wp:extent cx="5944870" cy="3883025"/>
+            <wp:effectExtent l="0" t="0" r="0" b="3175"/>
+            <wp:docPr id="1890867664" name="Imagen 1" descr="Interfaz de usuario gráfica, Aplicación&#10;&#10;El contenido generado por IA puede ser incorrecto."/>
+            <wp:cNvGraphicFramePr>
+              <a:graphicFrameLocks xmlns:a="http://schemas.openxmlformats.org/drawingml/2006/main" noChangeAspect="1"/>
+            </wp:cNvGraphicFramePr>
+            <a:graphic xmlns:a="http://schemas.openxmlformats.org/drawingml/2006/main">
+              <a:graphicData uri="http://schemas.openxmlformats.org/drawingml/2006/picture">
+                <pic:pic xmlns:pic="http://schemas.openxmlformats.org/drawingml/2006/picture">
+                  <pic:nvPicPr>
+                    <pic:cNvPr id="1890867664" name="Imagen 1" descr="Interfaz de usuario gráfica, Aplicación&#10;&#10;El contenido generado por IA puede ser incorrecto."/>
+                    <pic:cNvPicPr/>
+                  </pic:nvPicPr>
+                  <pic:blipFill>
+                    <a:blip r:embed="rId32"/>
+                    <a:stretch>
+                      <a:fillRect/>
+                    </a:stretch>
+                  </pic:blipFill>
+                  <pic:spPr>
+                    <a:xfrm>
+                      <a:off x="0" y="0"/>
+                      <a:ext cx="5944870" cy="3883025"/>
+                    </a:xfrm>
+                    <a:prstGeom prst="rect">
+                      <a:avLst/>
+                    </a:prstGeom>
+                  </pic:spPr>
+                </pic:pic>
+              </a:graphicData>
+            </a:graphic>
+          </wp:inline>
+        </w:drawing>
+      </w:r>
+    </w:p>
+    <w:p>
+      <w:pPr>
+        <w:rPr>
+          <w:lang w:val="es-ES"/>
+        </w:rPr>
+      </w:pPr>
+    </w:p>
+    <w:p>
+      <w:pPr>
+        <w:rPr>
+          <w:lang w:val="es-ES"/>
+        </w:rPr>
+      </w:pPr>
+    </w:p>
+    <w:p>
+      <w:pPr>
+        <w:rPr>
+          <w:lang w:val="es-ES"/>
+        </w:rPr>
+      </w:pPr>
+    </w:p>
+    <w:p>
+      <w:pPr>
+        <w:rPr>
+          <w:lang w:val="es-ES"/>
+        </w:rPr>
+      </w:pPr>
+    </w:p>
+    <w:p>
+      <w:pPr>
+        <w:rPr>
+          <w:lang w:val="es-ES"/>
+        </w:rPr>
+      </w:pPr>
+    </w:p>
+    <w:p>
+      <w:pPr>
+        <w:rPr>
+          <w:lang w:val="es-ES"/>
+        </w:rPr>
+      </w:pPr>
+    </w:p>
+    <w:p>
+      <w:pPr>
+        <w:rPr>
+          <w:lang w:val="es-ES"/>
+        </w:rPr>
+      </w:pPr>
+    </w:p>
+    <w:p>
+      <w:pPr>
+        <w:rPr>
+          <w:lang w:val="es-ES"/>
+        </w:rPr>
+      </w:pPr>
+    </w:p>
     <w:sectPr>
-      <w:headerReference w:type="default" r:id="rId31"/>
-      <w:footerReference w:type="default" r:id="rId32"/>
+      <w:headerReference w:type="default" r:id="rId33"/>
+      <w:footerReference w:type="default" r:id="rId34"/>
       <w:pgSz w:w="12242" w:h="20163" w:code="5"/>
       <w:pgMar w:top="1440" w:right="1440" w:bottom="1440" w:left="1440" w:header="709" w:footer="709" w:gutter="0"/>
       <w:cols w:space="708"/>
@@ -22566,6 +23462,9 @@
   </w:num>
   <w:num w:numId="80" w16cid:durableId="500969308">
     <w:abstractNumId w:val="18"/>
+  </w:num>
+  <w:num w:numId="81" w16cid:durableId="1804696216">
+    <w:abstractNumId w:val="41"/>
   </w:num>
 </w:numbering>
 </file>
@@ -22968,7 +23867,7 @@
   <w:style w:type="paragraph" w:default="1" w:styleId="Normal">
     <w:name w:val="Normal"/>
     <w:qFormat/>
-    <w:rsid w:val="00CE22CB"/>
+    <w:rsid w:val="00683334"/>
   </w:style>
   <w:style w:type="paragraph" w:styleId="Ttulo1">
     <w:name w:val="heading 1"/>
@@ -23076,6 +23975,7 @@
   <w:style w:type="character" w:default="1" w:styleId="Fuentedeprrafopredeter">
     <w:name w:val="Default Paragraph Font"/>
     <w:uiPriority w:val="1"/>
+    <w:semiHidden/>
     <w:unhideWhenUsed/>
   </w:style>
   <w:style w:type="table" w:default="1" w:styleId="Tablanormal">
@@ -23302,7 +24202,7 @@
     <w:rsid w:val="00711FAD"/>
     <w:pPr>
       <w:numPr>
-        <w:numId w:val="16"/>
+        <w:numId w:val="81"/>
       </w:numPr>
     </w:pPr>
   </w:style>
@@ -23860,11 +24760,148 @@
 </file>
 
 <file path=customXml/item1.xml><?xml version="1.0" encoding="utf-8"?>
-<p:properties xmlns:p="http://schemas.microsoft.com/office/2006/metadata/properties" xmlns:xsi="http://www.w3.org/2001/XMLSchema-instance" xmlns:pc="http://schemas.microsoft.com/office/infopath/2007/PartnerControls">
-  <documentManagement>
-    <_activity xmlns="91d0b5e5-6d80-425d-89ca-b2ee7294325c" xsi:nil="true"/>
-  </documentManagement>
-</p:properties>
+<b:Sources xmlns:b="http://schemas.openxmlformats.org/officeDocument/2006/bibliography" xmlns="http://schemas.openxmlformats.org/officeDocument/2006/bibliography" SelectedStyle="\APASixthEditionOfficeOnline.xsl" StyleName="APA" Version="6">
+  <b:Source xmlns:b="http://schemas.openxmlformats.org/officeDocument/2006/bibliography">
+    <b:Tag>MarcadorDePosición1</b:Tag>
+    <b:SourceType>BookSection</b:SourceType>
+    <b:Guid>{D6446B1D-64C8-40AA-8FD6-0DD4EDAC3D4B}</b:Guid>
+    <b:RefOrder>10</b:RefOrder>
+  </b:Source>
+  <b:Source xmlns:b="http://schemas.openxmlformats.org/officeDocument/2006/bibliography">
+    <b:Tag>Est20</b:Tag>
+    <b:SourceType>BookSection</b:SourceType>
+    <b:Guid>{21369F33-93AC-4F58-92CC-809990016EC4}</b:Guid>
+    <b:BookTitle>Fundamentos físicos de la informática</b:BookTitle>
+    <b:Year>1 de octubre de 2020</b:Year>
+    <b:Pages>p. 16</b:Pages>
+    <b:City>España</b:City>
+    <b:Author>
+      <b:Author>
+        <b:NameList>
+          <b:Person>
+            <b:Last>Estévez</b:Last>
+            <b:First>Raúl</b:First>
+            <b:Middle>Rengel</b:Middle>
+          </b:Person>
+        </b:NameList>
+      </b:Author>
+    </b:Author>
+    <b:Publisher>Obtenido de https://books.google.com.pe/books?id=03kEEAAAQBAJ&amp;newbks=0&amp;printsec=frontcover&amp;pg=PA16&amp;dq=carga+el%C3%A9ctrica+es+una+propiedad+f%C3%ADsica&amp;hl=es&amp;redir_esc=y#v=onepage&amp;q=carga%20el%C3%A9ctrica%20es%20una%20propiedad%20f%C3%ADsica&amp;f=false</b:Publisher>
+    <b:RefOrder>3</b:RefOrder>
+  </b:Source>
+  <b:Source>
+    <b:Tag>Efe24</b:Tag>
+    <b:SourceType>DocumentFromInternetSite</b:SourceType>
+    <b:Guid>{E906BA12-B0CE-4A55-94F7-5A2F66764144}</b:Guid>
+    <b:Title>Efecto triboeléctrico.</b:Title>
+    <b:InternetSiteTitle>Wikipedia, La encicloipedia libre</b:InternetSiteTitle>
+    <b:Year>2024</b:Year>
+    <b:Month>Enero</b:Month>
+    <b:Day>01</b:Day>
+    <b:URL>https://es.wikipedia.org/w/index.php?title=Efecto_triboel%C3%A9ctrico&amp;oldid=157885915</b:URL>
+    <b:RefOrder>5</b:RefOrder>
+  </b:Source>
+  <b:Source>
+    <b:Tag>Jam24</b:Tag>
+    <b:SourceType>DocumentFromInternetSite</b:SourceType>
+    <b:Guid>{B20807F2-2CEE-48DB-91FF-0A88F133FB9E}</b:Guid>
+    <b:Title>James Wimshurst</b:Title>
+    <b:Year>2024</b:Year>
+    <b:InternetSiteTitle>Wikipedia,La enciclopedia libre</b:InternetSiteTitle>
+    <b:Month>Junio</b:Month>
+    <b:Day>08</b:Day>
+    <b:URL>https://es.wikipedia.org/w/index.php?title=James_Wimshurst&amp;oldid=160626601</b:URL>
+    <b:RefOrder>1</b:RefOrder>
+  </b:Source>
+  <b:Source>
+    <b:Tag>Ley24</b:Tag>
+    <b:SourceType>DocumentFromInternetSite</b:SourceType>
+    <b:Guid>{1F95AB49-D49E-4C65-BECF-090784782684}</b:Guid>
+    <b:Title>Ley de Coulomb</b:Title>
+    <b:InternetSiteTitle>Wikipedia, La enciclopedia libre</b:InternetSiteTitle>
+    <b:Year>2024</b:Year>
+    <b:Month>Abril</b:Month>
+    <b:Day>26</b:Day>
+    <b:URL>https://es.wikipedia.org/w/index.php?title=Ley_de_Coulomb&amp;oldid=159714498</b:URL>
+    <b:RefOrder>4</b:RefOrder>
+  </b:Source>
+  <b:Source>
+    <b:Tag>Maq24</b:Tag>
+    <b:SourceType>DocumentFromInternetSite</b:SourceType>
+    <b:Guid>{34797DFD-E4A3-47CA-B5F6-ED8EFFBCD5E7}</b:Guid>
+    <b:Title>Maquina de Wimshurst</b:Title>
+    <b:InternetSiteTitle>Wikipedia,La enciclopedia libre</b:InternetSiteTitle>
+    <b:Year>2024</b:Year>
+    <b:Month>Enero</b:Month>
+    <b:Day>25</b:Day>
+    <b:URL>https://es.wikipedia.org/w/index.php?title=M%C3%A1quina_de_Wimshurst&amp;oldid=157712592</b:URL>
+    <b:RefOrder>2</b:RefOrder>
+  </b:Source>
+  <b:Source>
+    <b:Tag>Lam11</b:Tag>
+    <b:SourceType>InternetSite</b:SourceType>
+    <b:Guid>{929E0899-9DDC-41AC-92F5-AB24EED6DBCF}</b:Guid>
+    <b:Title>La maquina de Wimshurst</b:Title>
+    <b:Year>2011</b:Year>
+    <b:Month>Noviembre</b:Month>
+    <b:Day>05</b:Day>
+    <b:URL>https://laboratoriodeelectro.blogspot.com/p/maquina-de-wimshurst.html</b:URL>
+    <b:RefOrder>6</b:RefOrder>
+  </b:Source>
+  <b:Source>
+    <b:Tag>Bot24</b:Tag>
+    <b:SourceType>InternetSite</b:SourceType>
+    <b:Guid>{49477372-7124-40DE-B367-BF580BE8287F}</b:Guid>
+    <b:Title>Botella de Leyden</b:Title>
+    <b:InternetSiteTitle>Wikipedia, La enciclopedia libre.</b:InternetSiteTitle>
+    <b:Year>2024</b:Year>
+    <b:Month>Enero</b:Month>
+    <b:Day>25</b:Day>
+    <b:URL>https://es.wikipedia.org/w/index.php?title=Botella_de_Leyden&amp;oldid=157701111</b:URL>
+    <b:RefOrder>7</b:RefOrder>
+  </b:Source>
+  <b:Source>
+    <b:Tag>Rob22</b:Tag>
+    <b:SourceType>InternetSite</b:SourceType>
+    <b:Guid>{74D12AB1-1540-4DFF-8DC6-86EC7EEF9F74}</b:Guid>
+    <b:Author>
+      <b:Author>
+        <b:NameList>
+          <b:Person>
+            <b:Last>Roberto</b:Last>
+          </b:Person>
+        </b:NameList>
+      </b:Author>
+    </b:Author>
+    <b:Title>Pinza amperimétrica</b:Title>
+    <b:Year>2022</b:Year>
+    <b:Month>Mayo</b:Month>
+    <b:Day>04</b:Day>
+    <b:URL>https://www.certicalia.com/blog/pinza-amperimetrica-funcionamiento</b:URL>
+    <b:RefOrder>9</b:RefOrder>
+  </b:Source>
+  <b:Source>
+    <b:Tag>LaS16</b:Tag>
+    <b:SourceType>InternetSite</b:SourceType>
+    <b:Guid>{D8D44E73-0094-401C-BDC5-0F3226C06D5B}</b:Guid>
+    <b:Author>
+      <b:Author>
+        <b:NameList>
+          <b:Person>
+            <b:Last>Serena</b:Last>
+            <b:First>La</b:First>
+          </b:Person>
+        </b:NameList>
+      </b:Author>
+    </b:Author>
+    <b:Title>Scielo</b:Title>
+    <b:Year>2016</b:Year>
+    <b:Month>Septiembre</b:Month>
+    <b:Day>14</b:Day>
+    <b:URL>https://www.scielo.cl/scielo.php?script=sci_arttext&amp;pid=S0718-50062016000500011#:~:text=Se%20conforma%20de%20dos%20discos,indica%20en%20la%20Figura%203.</b:URL>
+    <b:RefOrder>8</b:RefOrder>
+  </b:Source>
+</b:Sources>
 </file>
 
 <file path=customXml/item2.xml><?xml version="1.0" encoding="utf-8"?>
@@ -24050,148 +25087,11 @@
 </file>
 
 <file path=customXml/item3.xml><?xml version="1.0" encoding="utf-8"?>
-<b:Sources xmlns:b="http://schemas.openxmlformats.org/officeDocument/2006/bibliography" xmlns="http://schemas.openxmlformats.org/officeDocument/2006/bibliography" SelectedStyle="\APASixthEditionOfficeOnline.xsl" StyleName="APA" Version="6">
-  <b:Source xmlns:b="http://schemas.openxmlformats.org/officeDocument/2006/bibliography">
-    <b:Tag>MarcadorDePosición1</b:Tag>
-    <b:SourceType>BookSection</b:SourceType>
-    <b:Guid>{D6446B1D-64C8-40AA-8FD6-0DD4EDAC3D4B}</b:Guid>
-    <b:RefOrder>10</b:RefOrder>
-  </b:Source>
-  <b:Source xmlns:b="http://schemas.openxmlformats.org/officeDocument/2006/bibliography">
-    <b:Tag>Est20</b:Tag>
-    <b:SourceType>BookSection</b:SourceType>
-    <b:Guid>{21369F33-93AC-4F58-92CC-809990016EC4}</b:Guid>
-    <b:BookTitle>Fundamentos físicos de la informática</b:BookTitle>
-    <b:Year>1 de octubre de 2020</b:Year>
-    <b:Pages>p. 16</b:Pages>
-    <b:City>España</b:City>
-    <b:Author>
-      <b:Author>
-        <b:NameList>
-          <b:Person>
-            <b:Last>Estévez</b:Last>
-            <b:First>Raúl</b:First>
-            <b:Middle>Rengel</b:Middle>
-          </b:Person>
-        </b:NameList>
-      </b:Author>
-    </b:Author>
-    <b:Publisher>Obtenido de https://books.google.com.pe/books?id=03kEEAAAQBAJ&amp;newbks=0&amp;printsec=frontcover&amp;pg=PA16&amp;dq=carga+el%C3%A9ctrica+es+una+propiedad+f%C3%ADsica&amp;hl=es&amp;redir_esc=y#v=onepage&amp;q=carga%20el%C3%A9ctrica%20es%20una%20propiedad%20f%C3%ADsica&amp;f=false</b:Publisher>
-    <b:RefOrder>3</b:RefOrder>
-  </b:Source>
-  <b:Source>
-    <b:Tag>Efe24</b:Tag>
-    <b:SourceType>DocumentFromInternetSite</b:SourceType>
-    <b:Guid>{E906BA12-B0CE-4A55-94F7-5A2F66764144}</b:Guid>
-    <b:Title>Efecto triboeléctrico.</b:Title>
-    <b:InternetSiteTitle>Wikipedia, La encicloipedia libre</b:InternetSiteTitle>
-    <b:Year>2024</b:Year>
-    <b:Month>Enero</b:Month>
-    <b:Day>01</b:Day>
-    <b:URL>https://es.wikipedia.org/w/index.php?title=Efecto_triboel%C3%A9ctrico&amp;oldid=157885915</b:URL>
-    <b:RefOrder>5</b:RefOrder>
-  </b:Source>
-  <b:Source>
-    <b:Tag>Jam24</b:Tag>
-    <b:SourceType>DocumentFromInternetSite</b:SourceType>
-    <b:Guid>{B20807F2-2CEE-48DB-91FF-0A88F133FB9E}</b:Guid>
-    <b:Title>James Wimshurst</b:Title>
-    <b:Year>2024</b:Year>
-    <b:InternetSiteTitle>Wikipedia,La enciclopedia libre</b:InternetSiteTitle>
-    <b:Month>Junio</b:Month>
-    <b:Day>08</b:Day>
-    <b:URL>https://es.wikipedia.org/w/index.php?title=James_Wimshurst&amp;oldid=160626601</b:URL>
-    <b:RefOrder>1</b:RefOrder>
-  </b:Source>
-  <b:Source>
-    <b:Tag>Ley24</b:Tag>
-    <b:SourceType>DocumentFromInternetSite</b:SourceType>
-    <b:Guid>{1F95AB49-D49E-4C65-BECF-090784782684}</b:Guid>
-    <b:Title>Ley de Coulomb</b:Title>
-    <b:InternetSiteTitle>Wikipedia, La enciclopedia libre</b:InternetSiteTitle>
-    <b:Year>2024</b:Year>
-    <b:Month>Abril</b:Month>
-    <b:Day>26</b:Day>
-    <b:URL>https://es.wikipedia.org/w/index.php?title=Ley_de_Coulomb&amp;oldid=159714498</b:URL>
-    <b:RefOrder>4</b:RefOrder>
-  </b:Source>
-  <b:Source>
-    <b:Tag>Maq24</b:Tag>
-    <b:SourceType>DocumentFromInternetSite</b:SourceType>
-    <b:Guid>{34797DFD-E4A3-47CA-B5F6-ED8EFFBCD5E7}</b:Guid>
-    <b:Title>Maquina de Wimshurst</b:Title>
-    <b:InternetSiteTitle>Wikipedia,La enciclopedia libre</b:InternetSiteTitle>
-    <b:Year>2024</b:Year>
-    <b:Month>Enero</b:Month>
-    <b:Day>25</b:Day>
-    <b:URL>https://es.wikipedia.org/w/index.php?title=M%C3%A1quina_de_Wimshurst&amp;oldid=157712592</b:URL>
-    <b:RefOrder>2</b:RefOrder>
-  </b:Source>
-  <b:Source>
-    <b:Tag>Lam11</b:Tag>
-    <b:SourceType>InternetSite</b:SourceType>
-    <b:Guid>{929E0899-9DDC-41AC-92F5-AB24EED6DBCF}</b:Guid>
-    <b:Title>La maquina de Wimshurst</b:Title>
-    <b:Year>2011</b:Year>
-    <b:Month>Noviembre</b:Month>
-    <b:Day>05</b:Day>
-    <b:URL>https://laboratoriodeelectro.blogspot.com/p/maquina-de-wimshurst.html</b:URL>
-    <b:RefOrder>6</b:RefOrder>
-  </b:Source>
-  <b:Source>
-    <b:Tag>Bot24</b:Tag>
-    <b:SourceType>InternetSite</b:SourceType>
-    <b:Guid>{49477372-7124-40DE-B367-BF580BE8287F}</b:Guid>
-    <b:Title>Botella de Leyden</b:Title>
-    <b:InternetSiteTitle>Wikipedia, La enciclopedia libre.</b:InternetSiteTitle>
-    <b:Year>2024</b:Year>
-    <b:Month>Enero</b:Month>
-    <b:Day>25</b:Day>
-    <b:URL>https://es.wikipedia.org/w/index.php?title=Botella_de_Leyden&amp;oldid=157701111</b:URL>
-    <b:RefOrder>7</b:RefOrder>
-  </b:Source>
-  <b:Source>
-    <b:Tag>Rob22</b:Tag>
-    <b:SourceType>InternetSite</b:SourceType>
-    <b:Guid>{74D12AB1-1540-4DFF-8DC6-86EC7EEF9F74}</b:Guid>
-    <b:Author>
-      <b:Author>
-        <b:NameList>
-          <b:Person>
-            <b:Last>Roberto</b:Last>
-          </b:Person>
-        </b:NameList>
-      </b:Author>
-    </b:Author>
-    <b:Title>Pinza amperimétrica</b:Title>
-    <b:Year>2022</b:Year>
-    <b:Month>Mayo</b:Month>
-    <b:Day>04</b:Day>
-    <b:URL>https://www.certicalia.com/blog/pinza-amperimetrica-funcionamiento</b:URL>
-    <b:RefOrder>9</b:RefOrder>
-  </b:Source>
-  <b:Source>
-    <b:Tag>LaS16</b:Tag>
-    <b:SourceType>InternetSite</b:SourceType>
-    <b:Guid>{D8D44E73-0094-401C-BDC5-0F3226C06D5B}</b:Guid>
-    <b:Author>
-      <b:Author>
-        <b:NameList>
-          <b:Person>
-            <b:Last>Serena</b:Last>
-            <b:First>La</b:First>
-          </b:Person>
-        </b:NameList>
-      </b:Author>
-    </b:Author>
-    <b:Title>Scielo</b:Title>
-    <b:Year>2016</b:Year>
-    <b:Month>Septiembre</b:Month>
-    <b:Day>14</b:Day>
-    <b:URL>https://www.scielo.cl/scielo.php?script=sci_arttext&amp;pid=S0718-50062016000500011#:~:text=Se%20conforma%20de%20dos%20discos,indica%20en%20la%20Figura%203.</b:URL>
-    <b:RefOrder>8</b:RefOrder>
-  </b:Source>
-</b:Sources>
+<p:properties xmlns:p="http://schemas.microsoft.com/office/2006/metadata/properties" xmlns:xsi="http://www.w3.org/2001/XMLSchema-instance" xmlns:pc="http://schemas.microsoft.com/office/infopath/2007/PartnerControls">
+  <documentManagement>
+    <_activity xmlns="91d0b5e5-6d80-425d-89ca-b2ee7294325c" xsi:nil="true"/>
+  </documentManagement>
+</p:properties>
 </file>
 
 <file path=customXml/item4.xml><?xml version="1.0" encoding="utf-8"?>
@@ -24204,11 +25104,9 @@
 </file>
 
 <file path=customXml/itemProps1.xml><?xml version="1.0" encoding="utf-8"?>
-<ds:datastoreItem xmlns:ds="http://schemas.openxmlformats.org/officeDocument/2006/customXml" ds:itemID="{8629FB73-DAB7-4A6F-BC40-5EEEE7733BF0}">
+<ds:datastoreItem xmlns:ds="http://schemas.openxmlformats.org/officeDocument/2006/customXml" ds:itemID="{0E97C4E7-6420-4A52-B88B-675ADA175589}">
   <ds:schemaRefs>
-    <ds:schemaRef ds:uri="http://schemas.microsoft.com/office/2006/metadata/properties"/>
-    <ds:schemaRef ds:uri="http://schemas.microsoft.com/office/infopath/2007/PartnerControls"/>
-    <ds:schemaRef ds:uri="91d0b5e5-6d80-425d-89ca-b2ee7294325c"/>
+    <ds:schemaRef ds:uri="http://schemas.openxmlformats.org/officeDocument/2006/bibliography"/>
   </ds:schemaRefs>
 </ds:datastoreItem>
 </file>
@@ -24232,9 +25130,11 @@
 </file>
 
 <file path=customXml/itemProps3.xml><?xml version="1.0" encoding="utf-8"?>
-<ds:datastoreItem xmlns:ds="http://schemas.openxmlformats.org/officeDocument/2006/customXml" ds:itemID="{0E97C4E7-6420-4A52-B88B-675ADA175589}">
+<ds:datastoreItem xmlns:ds="http://schemas.openxmlformats.org/officeDocument/2006/customXml" ds:itemID="{8629FB73-DAB7-4A6F-BC40-5EEEE7733BF0}">
   <ds:schemaRefs>
-    <ds:schemaRef ds:uri="http://schemas.openxmlformats.org/officeDocument/2006/bibliography"/>
+    <ds:schemaRef ds:uri="http://schemas.microsoft.com/office/2006/metadata/properties"/>
+    <ds:schemaRef ds:uri="http://schemas.microsoft.com/office/infopath/2007/PartnerControls"/>
+    <ds:schemaRef ds:uri="91d0b5e5-6d80-425d-89ca-b2ee7294325c"/>
   </ds:schemaRefs>
 </ds:datastoreItem>
 </file>

</xml_diff>